<commit_message>
docs(ux4g): add portal access sheet and split the sync plan into two parts
The sync has two halves that run in opposite directions. Where a design
exists, compare it against what is live and let the design lead. Where
business analysts designed the module, the build is the only surviving
record, so capture it first and let it lead until it has been redesigned.

Adds the portal access sheet used to collect this: an open collection
form, scaffolded with the roles and environment URLs already held in the
audit configs, that anyone can add to. Credentials are entered in the
shared Google Sheet, not here; the file in the repository is a blank
template.
</commit_message>
<xml_diff>
--- a/docs/ux4g/Design-Dev-Sync-Plan.docx
+++ b/docs/ux4g/Design-Dev-Sync-Plan.docx
@@ -231,7 +231,7 @@
           <w:rFonts w:ascii="Noto Sans" w:hAnsi="Noto Sans"/>
           <w:sz w:val="21"/>
         </w:rPr>
-        <w:t>Some modules were designed by business analysts without the design team involved. Those modules were then built. So for that part of the estate there is no design file worth calling a source of truth, the screens were never reviewed, and whatever the BAs produced exists in mixed formats or not at all.</w:t>
+        <w:t>Design and build have drifted apart, and for two different reasons.</w:t>
       </w:r>
     </w:p>
     <w:p>
@@ -243,7 +243,19 @@
           <w:rFonts w:ascii="Noto Sans" w:hAnsi="Noto Sans"/>
           <w:sz w:val="21"/>
         </w:rPr>
-        <w:t>The result is that design and build have drifted apart in a way we cannot see module by module.</w:t>
+        <w:t>Where the design team did the work, a Figma source exists but the build may no longer match it. Nobody has checked recently, and the differences are invisible until someone looks screen by screen.</w:t>
+      </w:r>
+    </w:p>
+    <w:p>
+      <w:pPr>
+        <w:spacing w:after="140"/>
+      </w:pPr>
+      <w:r>
+        <w:rPr>
+          <w:rFonts w:ascii="Noto Sans" w:hAnsi="Noto Sans"/>
+          <w:sz w:val="21"/>
+        </w:rPr>
+        <w:t>Where business analysts designed modules themselves, there is no design source worth trusting at all. Those screens were never reviewed, and whatever the BAs produced exists in mixed formats or not at all.</w:t>
       </w:r>
     </w:p>
     <w:p>
@@ -257,7 +269,7 @@
           <w:color w:val="1F3864"/>
           <w:sz w:val="27"/>
         </w:rPr>
-        <w:t>What we are doing about it</w:t>
+        <w:t>Two parts</w:t>
       </w:r>
     </w:p>
     <w:p>
@@ -269,46 +281,47 @@
           <w:rFonts w:ascii="Noto Sans" w:hAnsi="Noto Sans"/>
           <w:sz w:val="21"/>
         </w:rPr>
-        <w:t>Three things at once, in a single pass:</w:t>
+        <w:t>The work splits cleanly along that line, and the two halves run in opposite directions.</w:t>
       </w:r>
     </w:p>
     <w:p>
       <w:pPr>
-        <w:pStyle w:val="ListBullet"/>
-        <w:spacing w:after="60"/>
+        <w:spacing w:after="140"/>
       </w:pPr>
+      <w:r>
+        <w:rPr>
+          <w:rFonts w:ascii="Noto Sans" w:hAnsi="Noto Sans"/>
+          <w:b/>
+          <w:sz w:val="21"/>
+        </w:rPr>
+        <w:t>Part 1 — match design and build.</w:t>
+      </w:r>
       <w:r>
         <w:rPr>
           <w:rFonts w:ascii="Noto Sans" w:hAnsi="Noto Sans"/>
           <w:sz w:val="21"/>
         </w:rPr>
-        <w:t>Work out which modules were done without us.</w:t>
+        <w:t xml:space="preserve"> A design already exists. Compare it against what is live, record where they differ, and decide which one is right. The design usually leads.</w:t>
       </w:r>
     </w:p>
     <w:p>
       <w:pPr>
-        <w:pStyle w:val="ListBullet"/>
-        <w:spacing w:after="60"/>
+        <w:spacing w:after="140"/>
       </w:pPr>
+      <w:r>
+        <w:rPr>
+          <w:rFonts w:ascii="Noto Sans" w:hAnsi="Noto Sans"/>
+          <w:b/>
+          <w:sz w:val="21"/>
+        </w:rPr>
+        <w:t>Part 2 — clean up the BA-designed modules.</w:t>
+      </w:r>
       <w:r>
         <w:rPr>
           <w:rFonts w:ascii="Noto Sans" w:hAnsi="Noto Sans"/>
           <w:sz w:val="21"/>
         </w:rPr>
-        <w:t>Bring those modules up to design-team standard, redesigning them properly.</w:t>
-      </w:r>
-    </w:p>
-    <w:p>
-      <w:pPr>
-        <w:pStyle w:val="ListBullet"/>
-        <w:spacing w:after="60"/>
-      </w:pPr>
-      <w:r>
-        <w:rPr>
-          <w:rFonts w:ascii="Noto Sans" w:hAnsi="Noto Sans"/>
-          <w:sz w:val="21"/>
-        </w:rPr>
-        <w:t>Rebuild them in Figma on UX4G 3.0, so the design file becomes the source of truth.</w:t>
+        <w:t xml:space="preserve"> No design worth trusting exists, so the build is the only record of intent. Capture it, judge it, redesign it properly, and rebuild it in Figma. Here the build leads, at least to begin with.</w:t>
       </w:r>
     </w:p>
     <w:p>
@@ -320,7 +333,33 @@
           <w:rFonts w:ascii="Noto Sans" w:hAnsi="Noto Sans"/>
           <w:sz w:val="21"/>
         </w:rPr>
-        <w:t xml:space="preserve">The important decision is that this is </w:t>
+        <w:t>Knowing which part a screen belongs to is simply a matter of whether a design source exists. That single question sorts the estate, and it is the first column on the access inventory.</w:t>
+      </w:r>
+    </w:p>
+    <w:p>
+      <w:pPr>
+        <w:spacing w:before="320" w:after="120"/>
+      </w:pPr>
+      <w:r>
+        <w:rPr>
+          <w:rFonts w:ascii="Noto Sans" w:hAnsi="Noto Sans"/>
+          <w:b/>
+          <w:color w:val="1F3864"/>
+          <w:sz w:val="27"/>
+        </w:rPr>
+        <w:t>Doing it in one pass</w:t>
+      </w:r>
+    </w:p>
+    <w:p>
+      <w:pPr>
+        <w:spacing w:after="140"/>
+      </w:pPr>
+      <w:r>
+        <w:rPr>
+          <w:rFonts w:ascii="Noto Sans" w:hAnsi="Noto Sans"/>
+          <w:sz w:val="21"/>
+        </w:rPr>
+        <w:t xml:space="preserve">This is </w:t>
       </w:r>
       <w:r>
         <w:rPr>
@@ -335,7 +374,7 @@
           <w:rFonts w:ascii="Noto Sans" w:hAnsi="Noto Sans"/>
           <w:sz w:val="21"/>
         </w:rPr>
-        <w:t>. Every one of these modules has to be opened for UX4G regardless. Opening them once and doing both is considerably cheaper than doing UX4G now and redesign later, and it avoids asking the build team to absorb two rounds of change.</w:t>
+        <w:t>. Every affected screen has to be opened for UX4G regardless. Opening it once and doing both is considerably cheaper than doing UX4G now and the sync later, and it avoids asking the build team to absorb two rounds of change.</w:t>
       </w:r>
     </w:p>
     <w:p/>
@@ -414,6 +453,52 @@
           <w:sz w:val="21"/>
         </w:rPr>
         <w:t>We cannot sync what we have not identified, and we do not currently have a reliable list.</w:t>
+      </w:r>
+    </w:p>
+    <w:p>
+      <w:pPr>
+        <w:spacing w:after="140"/>
+      </w:pPr>
+      <w:r>
+        <w:rPr>
+          <w:rFonts w:ascii="Noto Sans" w:hAnsi="Noto Sans"/>
+          <w:b/>
+          <w:sz w:val="21"/>
+        </w:rPr>
+        <w:t>Start with the access inventory</w:t>
+      </w:r>
+      <w:r>
+        <w:rPr>
+          <w:rFonts w:ascii="Noto Sans" w:hAnsi="Noto Sans"/>
+          <w:sz w:val="21"/>
+        </w:rPr>
+        <w:t xml:space="preserve"> (</w:t>
+      </w:r>
+      <w:r>
+        <w:rPr>
+          <w:rFonts w:ascii="Consolas" w:hAnsi="Consolas"/>
+          <w:sz w:val="18"/>
+        </w:rPr>
+        <w:t>Design-Dev-Access-Inventory.xlsx</w:t>
+      </w:r>
+      <w:r>
+        <w:rPr>
+          <w:rFonts w:ascii="Noto Sans" w:hAnsi="Noto Sans"/>
+          <w:sz w:val="21"/>
+        </w:rPr>
+        <w:t>). Before any of this can happen, we need to know where each screen lives, which role can see it, and where its design is. The roles and environment URLs are already pre-filled from the audit configurations in the repository, so the remaining work is checking each login still works and then listing the screens.</w:t>
+      </w:r>
+    </w:p>
+    <w:p>
+      <w:pPr>
+        <w:spacing w:after="140"/>
+      </w:pPr>
+      <w:r>
+        <w:rPr>
+          <w:rFonts w:ascii="Noto Sans" w:hAnsi="Noto Sans"/>
+          <w:sz w:val="21"/>
+        </w:rPr>
+        <w:t>That inventory is what assigns each screen to part 1 or part 2, and both halves of the work read from it.</w:t>
       </w:r>
     </w:p>
     <w:p>

</xml_diff>